<commit_message>
feat: integrate Professor Chen Wen-Sheng profile from NDHU into bot, quick replies, and documentation
</commit_message>
<xml_diff>
--- a/校園課業小幫手_專題計畫書.docx
+++ b/校園課業小幫手_專題計畫書.docx
@@ -126,11 +126,9 @@
             <w:r>
               <w:rPr>
                 <w:rFonts w:ascii="微軟正黑體" w:hAnsi="微軟正黑體"/>
-                <w:b/>
-                <w:color w:val="C0392B"/>
                 <w:sz w:val="21"/>
               </w:rPr>
-              <w:t>【待填：例如 資訊專案設計 / 軟體工程實務】</w:t>
+              <w:t>國立東華大學 通識教育中心 程式設計課程</w:t>
             </w:r>
           </w:p>
         </w:tc>
@@ -172,11 +170,9 @@
             <w:r>
               <w:rPr>
                 <w:rFonts w:ascii="微軟正黑體" w:hAnsi="微軟正黑體"/>
-                <w:b/>
-                <w:color w:val="C0392B"/>
                 <w:sz w:val="21"/>
               </w:rPr>
-              <w:t>【待填：教授姓名】</w:t>
+              <w:t>陳文盛 助理教授 (國立東華大學 通識教育中心)</w:t>
             </w:r>
           </w:p>
         </w:tc>

</xml_diff>